<commit_message>
cascade: feat(speckit-004): T033 apply hook patch -- expect_prebuild_baseline_tolerable wired into meta_test_false_positive_proof.sh baseline check
Applies specs/004-fast-dev-cycles/patches/t033_meta_test_baseline_hook.patch (built + dry-run verified by the T033-unblock dispatch, deliberately deferred while F1-F5 concurrently edited this same file). Now that F1-F5 landed (0f22336c6f2) and the file is stable, patch applies cleanly at hunk-2 offset +29, bash -n clean.

Net effect: the strict zero-FAIL baseline check is now tolerant of check-ids explicitly covered by config/fastcycle/chronic_debt_allowlist.tsv (unexpired, evidenced, authorised rows only -- 7 currently). META_TEST_STRICT_BASELINE=1 restores the old strict behaviour. Everything else in the baseline check is unchanged.

(committed by parent commit_all.sh cascade depth=1)
</commit_message>
<xml_diff>
--- a/docs/owed_gate_implementations.docx
+++ b/docs/owed_gate_implementations.docx
@@ -2,7 +2,7 @@
 <file path=word/document.xml><?xml version="1.0" encoding="utf-8"?>
 <w:document xmlns:w="http://schemas.openxmlformats.org/wordprocessingml/2006/main" xmlns:m="http://schemas.openxmlformats.org/officeDocument/2006/math" xmlns:r="http://schemas.openxmlformats.org/officeDocument/2006/relationships" xmlns:o="urn:schemas-microsoft-com:office:office" xmlns:v="urn:schemas-microsoft-com:vml" xmlns:w10="urn:schemas-microsoft-com:office:word" xmlns:a="http://schemas.openxmlformats.org/drawingml/2006/main" xmlns:pic="http://schemas.openxmlformats.org/drawingml/2006/picture" xmlns:wp="http://schemas.openxmlformats.org/drawingml/2006/wordprocessingDrawing">
   <w:body>
-    <w:bookmarkStart w:id="63" w:name="X84d0ab51813067a5056b404fa880c512cb5c295"/>
+    <w:bookmarkStart w:id="64" w:name="X84d0ab51813067a5056b404fa880c512cb5c295"/>
     <w:p>
       <w:pPr>
         <w:pStyle w:val="Heading1"/>
@@ -26,7 +26,7 @@
         <w:t xml:space="preserve"> </w:t>
       </w:r>
       <w:r>
-        <w:t xml:space="preserve">4</w:t>
+        <w:t xml:space="preserve">5</w:t>
       </w:r>
       <w:r>
         <w:t xml:space="preserve"> </w:t>
@@ -42,7 +42,7 @@
         <w:t xml:space="preserve"> </w:t>
       </w:r>
       <w:r>
-        <w:t xml:space="preserve">2026-08-26T16:56:28Z</w:t>
+        <w:t xml:space="preserve">2026-09-28T18:09:28Z</w:t>
       </w:r>
       <w:r>
         <w:t xml:space="preserve"> </w:t>
@@ -9368,7 +9368,7 @@
       </w:r>
     </w:p>
     <w:bookmarkEnd w:id="53"/>
-    <w:bookmarkStart w:id="62" w:name="Xe8f3817a6818fe082c945e3f92a1ba918863c38"/>
+    <w:bookmarkStart w:id="63" w:name="Xe8f3817a6818fe082c945e3f92a1ba918863c38"/>
     <w:p>
       <w:pPr>
         <w:pStyle w:val="Heading2"/>
@@ -11200,8 +11200,1081 @@
       </w:r>
     </w:p>
     <w:bookmarkEnd w:id="61"/>
+    <w:bookmarkStart w:id="62" w:name="X581a025a10c1a7f9549cc4088bbe634aabbd825"/>
+    <w:p>
+      <w:pPr>
+        <w:pStyle w:val="Heading3"/>
+      </w:pPr>
+      <w:r>
+        <w:t xml:space="preserve">§11.4.275 (registered 2026-09-28 — the 10 recommended gates the anchor's own landing left named-but-undeferred, discovered by CM-GATE-LEDGER-RATCHET going 403→412 with zero rows added to</w:t>
+      </w:r>
+      <w:r>
+        <w:t xml:space="preserve"> </w:t>
+      </w:r>
+      <w:r>
+        <w:rPr>
+          <w:rStyle w:val="VerbatimChar"/>
+        </w:rPr>
+        <w:t xml:space="preserve">gate_ledger_deferrals.tsv</w:t>
+      </w:r>
+      <w:r>
+        <w:t xml:space="preserve"> </w:t>
+      </w:r>
+      <w:r>
+        <w:t xml:space="preserve">for the new names)</w:t>
+      </w:r>
+    </w:p>
+    <w:p>
+      <w:pPr>
+        <w:pStyle w:val="Compact"/>
+        <w:numPr>
+          <w:ilvl w:val="0"/>
+          <w:numId w:val="1139"/>
+        </w:numPr>
+      </w:pPr>
+      <w:r>
+        <w:rPr>
+          <w:b/>
+          <w:bCs/>
+        </w:rPr>
+        <w:t xml:space="preserve">OWED-GATE-096</w:t>
+      </w:r>
+      <w:r>
+        <w:t xml:space="preserve"> </w:t>
+      </w:r>
+      <w:r>
+        <w:t xml:space="preserve">—</w:t>
+      </w:r>
+      <w:r>
+        <w:t xml:space="preserve"> </w:t>
+      </w:r>
+      <w:r>
+        <w:rPr>
+          <w:rStyle w:val="VerbatimChar"/>
+        </w:rPr>
+        <w:t xml:space="preserve">CM-CODE-INDEX-AGENT-ACCESSIBLE</w:t>
+      </w:r>
+    </w:p>
+    <w:p>
+      <w:pPr>
+        <w:pStyle w:val="Compact"/>
+        <w:numPr>
+          <w:ilvl w:val="1"/>
+          <w:numId w:val="1140"/>
+        </w:numPr>
+      </w:pPr>
+      <w:r>
+        <w:rPr>
+          <w:b/>
+          <w:bCs/>
+        </w:rPr>
+        <w:t xml:space="preserve">Must assert:</w:t>
+      </w:r>
+      <w:r>
+        <w:t xml:space="preserve"> </w:t>
+      </w:r>
+      <w:r>
+        <w:t xml:space="preserve">asserts every indexed space (structural CodeGraph + semantic Lumen + any future code index) answers an unforgeable challenge issued from a genuinely DISPATCHED subagent, per agent, and that an enabled-but-undeclared server (no resolvable definition where the agent/subagent runs) FAILs rather than reading as configured</w:t>
+      </w:r>
+    </w:p>
+    <w:p>
+      <w:pPr>
+        <w:pStyle w:val="Compact"/>
+        <w:numPr>
+          <w:ilvl w:val="1"/>
+          <w:numId w:val="1140"/>
+        </w:numPr>
+      </w:pPr>
+      <w:r>
+        <w:rPr>
+          <w:b/>
+          <w:bCs/>
+        </w:rPr>
+        <w:t xml:space="preserve">Blocked on:</w:t>
+      </w:r>
+      <w:r>
+        <w:t xml:space="preserve"> </w:t>
+      </w:r>
+      <w:r>
+        <w:t xml:space="preserve">no per-agent/per-subagent accessibility-challenge harness exists in-repo today (§11.4.275(A), gate-code declared a separate work item)</w:t>
+      </w:r>
+    </w:p>
+    <w:p>
+      <w:pPr>
+        <w:pStyle w:val="Compact"/>
+        <w:numPr>
+          <w:ilvl w:val="1"/>
+          <w:numId w:val="1140"/>
+        </w:numPr>
+      </w:pPr>
+      <w:r>
+        <w:rPr>
+          <w:b/>
+          <w:bCs/>
+        </w:rPr>
+        <w:t xml:space="preserve">Paired §1.1 mutation:</w:t>
+      </w:r>
+      <w:r>
+        <w:t xml:space="preserve"> </w:t>
+      </w:r>
+      <w:r>
+        <w:t xml:space="preserve">owed together with the harness — per §11.4.115(F) observation-before-trust the gate is not trusted until a paired mutation has been OBSERVED to make it FAIL, and per §11.4.227(A) the row leaves the TSV and the baseline ratchets down only then.</w:t>
+      </w:r>
+    </w:p>
+    <w:p>
+      <w:pPr>
+        <w:pStyle w:val="Compact"/>
+        <w:numPr>
+          <w:ilvl w:val="0"/>
+          <w:numId w:val="1139"/>
+        </w:numPr>
+      </w:pPr>
+      <w:r>
+        <w:rPr>
+          <w:b/>
+          <w:bCs/>
+        </w:rPr>
+        <w:t xml:space="preserve">OWED-GATE-097</w:t>
+      </w:r>
+      <w:r>
+        <w:t xml:space="preserve"> </w:t>
+      </w:r>
+      <w:r>
+        <w:t xml:space="preserve">—</w:t>
+      </w:r>
+      <w:r>
+        <w:t xml:space="preserve"> </w:t>
+      </w:r>
+      <w:r>
+        <w:rPr>
+          <w:rStyle w:val="VerbatimChar"/>
+        </w:rPr>
+        <w:t xml:space="preserve">CM-CODE-INDEX-COMPLETE-BEFORE-READY</w:t>
+      </w:r>
+    </w:p>
+    <w:p>
+      <w:pPr>
+        <w:pStyle w:val="Compact"/>
+        <w:numPr>
+          <w:ilvl w:val="1"/>
+          <w:numId w:val="1141"/>
+        </w:numPr>
+      </w:pPr>
+      <w:r>
+        <w:rPr>
+          <w:b/>
+          <w:bCs/>
+        </w:rPr>
+        <w:t xml:space="preserve">Must assert:</w:t>
+      </w:r>
+      <w:r>
+        <w:t xml:space="preserve"> </w:t>
+      </w:r>
+      <w:r>
+        <w:t xml:space="preserve">asserts an index is called ready only when its pending backlog is zero, its state reports complete, its file count is within the consumer-declared tolerance of the accepted expected count, and its required schema indexes exist, with every count and every empty result control-needled per §11.4.273</w:t>
+      </w:r>
+    </w:p>
+    <w:p>
+      <w:pPr>
+        <w:pStyle w:val="Compact"/>
+        <w:numPr>
+          <w:ilvl w:val="1"/>
+          <w:numId w:val="1141"/>
+        </w:numPr>
+      </w:pPr>
+      <w:r>
+        <w:rPr>
+          <w:b/>
+          <w:bCs/>
+        </w:rPr>
+        <w:t xml:space="preserve">Blocked on:</w:t>
+      </w:r>
+      <w:r>
+        <w:t xml:space="preserve"> </w:t>
+      </w:r>
+      <w:r>
+        <w:t xml:space="preserve">no readiness-verdict harness reads the index's pending/state/count/schema fields today (§11.4.275(C), gate-code declared a separate work item)</w:t>
+      </w:r>
+    </w:p>
+    <w:p>
+      <w:pPr>
+        <w:pStyle w:val="Compact"/>
+        <w:numPr>
+          <w:ilvl w:val="1"/>
+          <w:numId w:val="1141"/>
+        </w:numPr>
+      </w:pPr>
+      <w:r>
+        <w:rPr>
+          <w:b/>
+          <w:bCs/>
+        </w:rPr>
+        <w:t xml:space="preserve">Paired §1.1 mutation:</w:t>
+      </w:r>
+      <w:r>
+        <w:t xml:space="preserve"> </w:t>
+      </w:r>
+      <w:r>
+        <w:t xml:space="preserve">owed together with the harness — per §11.4.115(F) observation-before-trust the gate is not trusted until a paired mutation has been OBSERVED to make it FAIL, and per §11.4.227(A) the row leaves the TSV and the baseline ratchets down only then.</w:t>
+      </w:r>
+    </w:p>
+    <w:p>
+      <w:pPr>
+        <w:pStyle w:val="Compact"/>
+        <w:numPr>
+          <w:ilvl w:val="0"/>
+          <w:numId w:val="1139"/>
+        </w:numPr>
+      </w:pPr>
+      <w:r>
+        <w:rPr>
+          <w:b/>
+          <w:bCs/>
+        </w:rPr>
+        <w:t xml:space="preserve">OWED-GATE-098</w:t>
+      </w:r>
+      <w:r>
+        <w:t xml:space="preserve"> </w:t>
+      </w:r>
+      <w:r>
+        <w:t xml:space="preserve">—</w:t>
+      </w:r>
+      <w:r>
+        <w:t xml:space="preserve"> </w:t>
+      </w:r>
+      <w:r>
+        <w:rPr>
+          <w:rStyle w:val="VerbatimChar"/>
+        </w:rPr>
+        <w:t xml:space="preserve">CM-LUMEN-MODEL-PROVEN</w:t>
+      </w:r>
+    </w:p>
+    <w:p>
+      <w:pPr>
+        <w:pStyle w:val="Compact"/>
+        <w:numPr>
+          <w:ilvl w:val="1"/>
+          <w:numId w:val="1142"/>
+        </w:numPr>
+      </w:pPr>
+      <w:r>
+        <w:rPr>
+          <w:b/>
+          <w:bCs/>
+        </w:rPr>
+        <w:t xml:space="preserve">Must assert:</w:t>
+      </w:r>
+      <w:r>
+        <w:t xml:space="preserve"> </w:t>
+      </w:r>
+      <w:r>
+        <w:t xml:space="preserve">asserts the semantic index's embedding model is provisioned rootless (§11.4.161) and proven by a real embed call returning the declared dimensionality — a model listing alone is refused as insufficient evidence</w:t>
+      </w:r>
+    </w:p>
+    <w:p>
+      <w:pPr>
+        <w:pStyle w:val="Compact"/>
+        <w:numPr>
+          <w:ilvl w:val="1"/>
+          <w:numId w:val="1142"/>
+        </w:numPr>
+      </w:pPr>
+      <w:r>
+        <w:rPr>
+          <w:b/>
+          <w:bCs/>
+        </w:rPr>
+        <w:t xml:space="preserve">Blocked on:</w:t>
+      </w:r>
+      <w:r>
+        <w:t xml:space="preserve"> </w:t>
+      </w:r>
+      <w:r>
+        <w:t xml:space="preserve">no embed-call proof harness exists in-repo today (§11.4.275(B), gate-code declared a separate work item)</w:t>
+      </w:r>
+    </w:p>
+    <w:p>
+      <w:pPr>
+        <w:pStyle w:val="Compact"/>
+        <w:numPr>
+          <w:ilvl w:val="1"/>
+          <w:numId w:val="1142"/>
+        </w:numPr>
+      </w:pPr>
+      <w:r>
+        <w:rPr>
+          <w:b/>
+          <w:bCs/>
+        </w:rPr>
+        <w:t xml:space="preserve">Paired §1.1 mutation:</w:t>
+      </w:r>
+      <w:r>
+        <w:t xml:space="preserve"> </w:t>
+      </w:r>
+      <w:r>
+        <w:t xml:space="preserve">owed together with the harness — per §11.4.115(F) observation-before-trust the gate is not trusted until a paired mutation has been OBSERVED to make it FAIL, and per §11.4.227(A) the row leaves the TSV and the baseline ratchets down only then.</w:t>
+      </w:r>
+    </w:p>
+    <w:p>
+      <w:pPr>
+        <w:pStyle w:val="Compact"/>
+        <w:numPr>
+          <w:ilvl w:val="0"/>
+          <w:numId w:val="1139"/>
+        </w:numPr>
+      </w:pPr>
+      <w:r>
+        <w:rPr>
+          <w:b/>
+          <w:bCs/>
+        </w:rPr>
+        <w:t xml:space="preserve">OWED-GATE-099</w:t>
+      </w:r>
+      <w:r>
+        <w:t xml:space="preserve"> </w:t>
+      </w:r>
+      <w:r>
+        <w:t xml:space="preserve">—</w:t>
+      </w:r>
+      <w:r>
+        <w:t xml:space="preserve"> </w:t>
+      </w:r>
+      <w:r>
+        <w:rPr>
+          <w:rStyle w:val="VerbatimChar"/>
+        </w:rPr>
+        <w:t xml:space="preserve">CM-LUMEN-SCOPED-FRESH</w:t>
+      </w:r>
+    </w:p>
+    <w:p>
+      <w:pPr>
+        <w:pStyle w:val="Compact"/>
+        <w:numPr>
+          <w:ilvl w:val="1"/>
+          <w:numId w:val="1143"/>
+        </w:numPr>
+      </w:pPr>
+      <w:r>
+        <w:rPr>
+          <w:b/>
+          <w:bCs/>
+        </w:rPr>
+        <w:t xml:space="preserve">Must assert:</w:t>
+      </w:r>
+      <w:r>
+        <w:t xml:space="preserve"> </w:t>
+      </w:r>
+      <w:r>
+        <w:t xml:space="preserve">asserts the semantic index's scope is GENERATED from the same class source as the structural CodeGraph scope (§11.4.78(7)–(8),</w:t>
+      </w:r>
+      <w:r>
+        <w:t xml:space="preserve"> </w:t>
+      </w:r>
+      <w:r>
+        <w:rPr>
+          <w:rStyle w:val="VerbatimChar"/>
+        </w:rPr>
+        <w:t xml:space="preserve">scripts/lumen/gen_lumenignore.py</w:t>
+      </w:r>
+      <w:r>
+        <w:t xml:space="preserve">) so third-party and secret classes are excluded identically, and that health = files AND chunks non-zero + a known-symbol search hit + a negative control + freshness within the consumer-declared TTL</w:t>
+      </w:r>
+    </w:p>
+    <w:p>
+      <w:pPr>
+        <w:pStyle w:val="Compact"/>
+        <w:numPr>
+          <w:ilvl w:val="1"/>
+          <w:numId w:val="1143"/>
+        </w:numPr>
+      </w:pPr>
+      <w:r>
+        <w:rPr>
+          <w:b/>
+          <w:bCs/>
+        </w:rPr>
+        <w:t xml:space="preserve">Blocked on:</w:t>
+      </w:r>
+      <w:r>
+        <w:t xml:space="preserve"> </w:t>
+      </w:r>
+      <w:r>
+        <w:t xml:space="preserve">no scope-provenance-plus-health harness exists in-repo today (§11.4.275(B), gate-code declared a separate work item)</w:t>
+      </w:r>
+    </w:p>
+    <w:p>
+      <w:pPr>
+        <w:pStyle w:val="Compact"/>
+        <w:numPr>
+          <w:ilvl w:val="1"/>
+          <w:numId w:val="1143"/>
+        </w:numPr>
+      </w:pPr>
+      <w:r>
+        <w:rPr>
+          <w:b/>
+          <w:bCs/>
+        </w:rPr>
+        <w:t xml:space="preserve">Paired §1.1 mutation:</w:t>
+      </w:r>
+      <w:r>
+        <w:t xml:space="preserve"> </w:t>
+      </w:r>
+      <w:r>
+        <w:t xml:space="preserve">owed together with the harness — per §11.4.115(F) observation-before-trust the gate is not trusted until a paired mutation has been OBSERVED to make it FAIL, and per §11.4.227(A) the row leaves the TSV and the baseline ratchets down only then.</w:t>
+      </w:r>
+    </w:p>
+    <w:p>
+      <w:pPr>
+        <w:pStyle w:val="Compact"/>
+        <w:numPr>
+          <w:ilvl w:val="0"/>
+          <w:numId w:val="1139"/>
+        </w:numPr>
+      </w:pPr>
+      <w:r>
+        <w:rPr>
+          <w:b/>
+          <w:bCs/>
+        </w:rPr>
+        <w:t xml:space="preserve">OWED-GATE-100</w:t>
+      </w:r>
+      <w:r>
+        <w:t xml:space="preserve"> </w:t>
+      </w:r>
+      <w:r>
+        <w:t xml:space="preserve">—</w:t>
+      </w:r>
+      <w:r>
+        <w:t xml:space="preserve"> </w:t>
+      </w:r>
+      <w:r>
+        <w:rPr>
+          <w:rStyle w:val="VerbatimChar"/>
+        </w:rPr>
+        <w:t xml:space="preserve">CM-CODE-INDEX-BENCH</w:t>
+      </w:r>
+    </w:p>
+    <w:p>
+      <w:pPr>
+        <w:pStyle w:val="Compact"/>
+        <w:numPr>
+          <w:ilvl w:val="1"/>
+          <w:numId w:val="1144"/>
+        </w:numPr>
+      </w:pPr>
+      <w:r>
+        <w:rPr>
+          <w:b/>
+          <w:bCs/>
+        </w:rPr>
+        <w:t xml:space="preserve">Must assert:</w:t>
+      </w:r>
+      <w:r>
+        <w:t xml:space="preserve"> </w:t>
+      </w:r>
+      <w:r>
+        <w:t xml:space="preserve">asserts a fixed golden-answer query set is run N≥3 times against the index route AND a grep+read baseline with an identical canonical result hash (§11.4.50), token reduction computed ONLY over queries BOTH routes answered correctly, wrong answers reported separately BY QUERY ID and never averaged away, and thresholds sourced from consumer DATA never constitutional literals — the sanctioned</w:t>
+      </w:r>
+      <w:r>
+        <w:t xml:space="preserve"> </w:t>
+      </w:r>
+      <w:r>
+        <w:rPr>
+          <w:rStyle w:val="VerbatimChar"/>
+        </w:rPr>
+        <w:t xml:space="preserve">constitution/scripts/lumen/lumen_verify.sh</w:t>
+      </w:r>
+      <w:r>
+        <w:t xml:space="preserve"> </w:t>
+      </w:r>
+      <w:r>
+        <w:t xml:space="preserve">harness already exists and has been run live (see the §11.4.275 EXTENSION, 2026-09-25); only THIS recommended gate wiring it into the pre-build/pre-commit seam remains owed</w:t>
+      </w:r>
+    </w:p>
+    <w:p>
+      <w:pPr>
+        <w:pStyle w:val="Compact"/>
+        <w:numPr>
+          <w:ilvl w:val="1"/>
+          <w:numId w:val="1144"/>
+        </w:numPr>
+      </w:pPr>
+      <w:r>
+        <w:rPr>
+          <w:b/>
+          <w:bCs/>
+        </w:rPr>
+        <w:t xml:space="preserve">Blocked on:</w:t>
+      </w:r>
+      <w:r>
+        <w:t xml:space="preserve"> </w:t>
+      </w:r>
+      <w:r>
+        <w:t xml:space="preserve">the harness is landed (</w:t>
+      </w:r>
+      <w:r>
+        <w:rPr>
+          <w:rStyle w:val="VerbatimChar"/>
+        </w:rPr>
+        <w:t xml:space="preserve">constitution/scripts/lumen/lumen_verify.sh</w:t>
+      </w:r>
+      <w:r>
+        <w:t xml:space="preserve"> </w:t>
+      </w:r>
+      <w:r>
+        <w:t xml:space="preserve">+</w:t>
+      </w:r>
+      <w:r>
+        <w:t xml:space="preserve"> </w:t>
+      </w:r>
+      <w:r>
+        <w:rPr>
+          <w:rStyle w:val="VerbatimChar"/>
+        </w:rPr>
+        <w:t xml:space="preserve">constitution/scripts/lumen/tests/test_lumen_verify.sh</w:t>
+      </w:r>
+      <w:r>
+        <w:t xml:space="preserve">); the gate-code that WIRES its exit status into a pre-build/pre-commit CM-* check is the sole remaining piece (§11.4.275(D), gate-code declared a separate work item)</w:t>
+      </w:r>
+    </w:p>
+    <w:p>
+      <w:pPr>
+        <w:pStyle w:val="Compact"/>
+        <w:numPr>
+          <w:ilvl w:val="1"/>
+          <w:numId w:val="1144"/>
+        </w:numPr>
+      </w:pPr>
+      <w:r>
+        <w:rPr>
+          <w:b/>
+          <w:bCs/>
+        </w:rPr>
+        <w:t xml:space="preserve">Paired §1.1 mutation:</w:t>
+      </w:r>
+      <w:r>
+        <w:t xml:space="preserve"> </w:t>
+      </w:r>
+      <w:r>
+        <w:t xml:space="preserve">owed together with the harness — per §11.4.115(F) observation-before-trust the gate is not trusted until a paired mutation has been OBSERVED to make it FAIL, and per §11.4.227(A) the row leaves the TSV and the baseline ratchets down only then.</w:t>
+      </w:r>
+    </w:p>
+    <w:p>
+      <w:pPr>
+        <w:pStyle w:val="Compact"/>
+        <w:numPr>
+          <w:ilvl w:val="0"/>
+          <w:numId w:val="1139"/>
+        </w:numPr>
+      </w:pPr>
+      <w:r>
+        <w:rPr>
+          <w:b/>
+          <w:bCs/>
+        </w:rPr>
+        <w:t xml:space="preserve">OWED-GATE-101</w:t>
+      </w:r>
+      <w:r>
+        <w:t xml:space="preserve"> </w:t>
+      </w:r>
+      <w:r>
+        <w:t xml:space="preserve">—</w:t>
+      </w:r>
+      <w:r>
+        <w:t xml:space="preserve"> </w:t>
+      </w:r>
+      <w:r>
+        <w:rPr>
+          <w:rStyle w:val="VerbatimChar"/>
+        </w:rPr>
+        <w:t xml:space="preserve">CM-CODEGRAPH-SCOPE-PROOF</w:t>
+      </w:r>
+    </w:p>
+    <w:p>
+      <w:pPr>
+        <w:pStyle w:val="Compact"/>
+        <w:numPr>
+          <w:ilvl w:val="1"/>
+          <w:numId w:val="1145"/>
+        </w:numPr>
+      </w:pPr>
+      <w:r>
+        <w:rPr>
+          <w:b/>
+          <w:bCs/>
+        </w:rPr>
+        <w:t xml:space="preserve">Must assert:</w:t>
+      </w:r>
+      <w:r>
+        <w:t xml:space="preserve"> </w:t>
+      </w:r>
+      <w:r>
+        <w:t xml:space="preserve">asserts the structural CodeGraph index's effective scope is enumerated through the runner's own discovery code and the resulting count is within tolerance of the accepted expected count, with zero third-party files, zero secret-class files, and at least one file per own-org root — every count control-needled per §11.4.273</w:t>
+      </w:r>
+    </w:p>
+    <w:p>
+      <w:pPr>
+        <w:pStyle w:val="Compact"/>
+        <w:numPr>
+          <w:ilvl w:val="1"/>
+          <w:numId w:val="1145"/>
+        </w:numPr>
+      </w:pPr>
+      <w:r>
+        <w:rPr>
+          <w:b/>
+          <w:bCs/>
+        </w:rPr>
+        <w:t xml:space="preserve">Blocked on:</w:t>
+      </w:r>
+      <w:r>
+        <w:t xml:space="preserve"> </w:t>
+      </w:r>
+      <w:r>
+        <w:t xml:space="preserve">no scope-enumeration-proof harness exists in-repo today (§11.4.78(7) cross-referenced by §11.4.275, gate-code declared a separate work item)</w:t>
+      </w:r>
+    </w:p>
+    <w:p>
+      <w:pPr>
+        <w:pStyle w:val="Compact"/>
+        <w:numPr>
+          <w:ilvl w:val="1"/>
+          <w:numId w:val="1145"/>
+        </w:numPr>
+      </w:pPr>
+      <w:r>
+        <w:rPr>
+          <w:b/>
+          <w:bCs/>
+        </w:rPr>
+        <w:t xml:space="preserve">Paired §1.1 mutation:</w:t>
+      </w:r>
+      <w:r>
+        <w:t xml:space="preserve"> </w:t>
+      </w:r>
+      <w:r>
+        <w:t xml:space="preserve">owed together with the harness — per §11.4.115(F) observation-before-trust the gate is not trusted until a paired mutation has been OBSERVED to make it FAIL, and per §11.4.227(A) the row leaves the TSV and the baseline ratchets down only then.</w:t>
+      </w:r>
+    </w:p>
+    <w:p>
+      <w:pPr>
+        <w:pStyle w:val="Compact"/>
+        <w:numPr>
+          <w:ilvl w:val="0"/>
+          <w:numId w:val="1139"/>
+        </w:numPr>
+      </w:pPr>
+      <w:r>
+        <w:rPr>
+          <w:b/>
+          <w:bCs/>
+        </w:rPr>
+        <w:t xml:space="preserve">OWED-GATE-102</w:t>
+      </w:r>
+      <w:r>
+        <w:t xml:space="preserve"> </w:t>
+      </w:r>
+      <w:r>
+        <w:t xml:space="preserve">—</w:t>
+      </w:r>
+      <w:r>
+        <w:t xml:space="preserve"> </w:t>
+      </w:r>
+      <w:r>
+        <w:rPr>
+          <w:rStyle w:val="VerbatimChar"/>
+        </w:rPr>
+        <w:t xml:space="preserve">CM-CODEGRAPH-UPGRADE-PROBE-GATED</w:t>
+      </w:r>
+    </w:p>
+    <w:p>
+      <w:pPr>
+        <w:pStyle w:val="Compact"/>
+        <w:numPr>
+          <w:ilvl w:val="1"/>
+          <w:numId w:val="1146"/>
+        </w:numPr>
+      </w:pPr>
+      <w:r>
+        <w:rPr>
+          <w:b/>
+          <w:bCs/>
+        </w:rPr>
+        <w:t xml:space="preserve">Must assert:</w:t>
+      </w:r>
+      <w:r>
+        <w:t xml:space="preserve"> </w:t>
+      </w:r>
+      <w:r>
+        <w:t xml:space="preserve">asserts a CodeGraph runner upgrade is gated on a compatibility probe (loader config filename/keys, bulk-window hazard probe, runner-patch applicability) and refuses loudly, keeping the prior version, when the patched runner cannot be re-proven</w:t>
+      </w:r>
+    </w:p>
+    <w:p>
+      <w:pPr>
+        <w:pStyle w:val="Compact"/>
+        <w:numPr>
+          <w:ilvl w:val="1"/>
+          <w:numId w:val="1146"/>
+        </w:numPr>
+      </w:pPr>
+      <w:r>
+        <w:rPr>
+          <w:b/>
+          <w:bCs/>
+        </w:rPr>
+        <w:t xml:space="preserve">Blocked on:</w:t>
+      </w:r>
+      <w:r>
+        <w:t xml:space="preserve"> </w:t>
+      </w:r>
+      <w:r>
+        <w:t xml:space="preserve">no upgrade-compatibility-probe harness exists in-repo today (§11.4.80(4) cross-referenced by §11.4.275, gate-code declared a separate work item)</w:t>
+      </w:r>
+    </w:p>
+    <w:p>
+      <w:pPr>
+        <w:pStyle w:val="Compact"/>
+        <w:numPr>
+          <w:ilvl w:val="1"/>
+          <w:numId w:val="1146"/>
+        </w:numPr>
+      </w:pPr>
+      <w:r>
+        <w:rPr>
+          <w:b/>
+          <w:bCs/>
+        </w:rPr>
+        <w:t xml:space="preserve">Paired §1.1 mutation:</w:t>
+      </w:r>
+      <w:r>
+        <w:t xml:space="preserve"> </w:t>
+      </w:r>
+      <w:r>
+        <w:t xml:space="preserve">owed together with the harness — per §11.4.115(F) observation-before-trust the gate is not trusted until a paired mutation has been OBSERVED to make it FAIL, and per §11.4.227(A) the row leaves the TSV and the baseline ratchets down only then.</w:t>
+      </w:r>
+    </w:p>
+    <w:p>
+      <w:pPr>
+        <w:pStyle w:val="Compact"/>
+        <w:numPr>
+          <w:ilvl w:val="0"/>
+          <w:numId w:val="1139"/>
+        </w:numPr>
+      </w:pPr>
+      <w:r>
+        <w:rPr>
+          <w:b/>
+          <w:bCs/>
+        </w:rPr>
+        <w:t xml:space="preserve">OWED-GATE-103</w:t>
+      </w:r>
+      <w:r>
+        <w:t xml:space="preserve"> </w:t>
+      </w:r>
+      <w:r>
+        <w:t xml:space="preserve">—</w:t>
+      </w:r>
+      <w:r>
+        <w:t xml:space="preserve"> </w:t>
+      </w:r>
+      <w:r>
+        <w:rPr>
+          <w:rStyle w:val="VerbatimChar"/>
+        </w:rPr>
+        <w:t xml:space="preserve">CM-CODEGRAPH-WRITER-EXCLUSIVE</w:t>
+      </w:r>
+    </w:p>
+    <w:p>
+      <w:pPr>
+        <w:pStyle w:val="Compact"/>
+        <w:numPr>
+          <w:ilvl w:val="1"/>
+          <w:numId w:val="1147"/>
+        </w:numPr>
+      </w:pPr>
+      <w:r>
+        <w:rPr>
+          <w:b/>
+          <w:bCs/>
+        </w:rPr>
+        <w:t xml:space="preserve">Must assert:</w:t>
+      </w:r>
+      <w:r>
+        <w:t xml:space="preserve"> </w:t>
+      </w:r>
+      <w:r>
+        <w:t xml:space="preserve">asserts every init/index/sync write goes through the single sanctioned writer entry, which refuses while any live process targets the same root (real cmdline per §11.4.196(D), regardless of lock age — never age-based lock deletion)</w:t>
+      </w:r>
+    </w:p>
+    <w:p>
+      <w:pPr>
+        <w:pStyle w:val="Compact"/>
+        <w:numPr>
+          <w:ilvl w:val="1"/>
+          <w:numId w:val="1147"/>
+        </w:numPr>
+      </w:pPr>
+      <w:r>
+        <w:rPr>
+          <w:b/>
+          <w:bCs/>
+        </w:rPr>
+        <w:t xml:space="preserve">Blocked on:</w:t>
+      </w:r>
+      <w:r>
+        <w:t xml:space="preserve"> </w:t>
+      </w:r>
+      <w:r>
+        <w:t xml:space="preserve">no single-writer-exclusivity proof harness exists in-repo today (§11.4.80(5) cross-referenced by §11.4.275(G), gate-code declared a separate work item)</w:t>
+      </w:r>
+    </w:p>
+    <w:p>
+      <w:pPr>
+        <w:pStyle w:val="Compact"/>
+        <w:numPr>
+          <w:ilvl w:val="1"/>
+          <w:numId w:val="1147"/>
+        </w:numPr>
+      </w:pPr>
+      <w:r>
+        <w:rPr>
+          <w:b/>
+          <w:bCs/>
+        </w:rPr>
+        <w:t xml:space="preserve">Paired §1.1 mutation:</w:t>
+      </w:r>
+      <w:r>
+        <w:t xml:space="preserve"> </w:t>
+      </w:r>
+      <w:r>
+        <w:t xml:space="preserve">owed together with the harness — per §11.4.115(F) observation-before-trust the gate is not trusted until a paired mutation has been OBSERVED to make it FAIL, and per §11.4.227(A) the row leaves the TSV and the baseline ratchets down only then.</w:t>
+      </w:r>
+    </w:p>
+    <w:p>
+      <w:pPr>
+        <w:pStyle w:val="Compact"/>
+        <w:numPr>
+          <w:ilvl w:val="0"/>
+          <w:numId w:val="1139"/>
+        </w:numPr>
+      </w:pPr>
+      <w:r>
+        <w:rPr>
+          <w:b/>
+          <w:bCs/>
+        </w:rPr>
+        <w:t xml:space="preserve">OWED-GATE-104</w:t>
+      </w:r>
+      <w:r>
+        <w:t xml:space="preserve"> </w:t>
+      </w:r>
+      <w:r>
+        <w:t xml:space="preserve">—</w:t>
+      </w:r>
+      <w:r>
+        <w:t xml:space="preserve"> </w:t>
+      </w:r>
+      <w:r>
+        <w:rPr>
+          <w:rStyle w:val="VerbatimChar"/>
+        </w:rPr>
+        <w:t xml:space="preserve">CM-CODEGRAPH-BULK-BY-BACKLOG</w:t>
+      </w:r>
+    </w:p>
+    <w:p>
+      <w:pPr>
+        <w:pStyle w:val="Compact"/>
+        <w:numPr>
+          <w:ilvl w:val="1"/>
+          <w:numId w:val="1148"/>
+        </w:numPr>
+      </w:pPr>
+      <w:r>
+        <w:rPr>
+          <w:b/>
+          <w:bCs/>
+        </w:rPr>
+        <w:t xml:space="preserve">Must assert:</w:t>
+      </w:r>
+      <w:r>
+        <w:t xml:space="preserve"> </w:t>
+      </w:r>
+      <w:r>
+        <w:t xml:space="preserve">asserts a bulk re-index/re-sync classification is derived from PENDING backlog (unresolved-reference count, files still to parse), never from rows already stored — the exact launcher defect the §11.4.275 forensic anchor clause (5) captured (tens of millions of references bulk-run foreground and unsupervised because</w:t>
+      </w:r>
+      <w:r>
+        <w:t xml:space="preserve"> </w:t>
+      </w:r>
+      <w:r>
+        <w:rPr>
+          <w:rStyle w:val="VerbatimChar"/>
+        </w:rPr>
+        <w:t xml:space="preserve">sync</w:t>
+      </w:r>
+      <w:r>
+        <w:t xml:space="preserve"> </w:t>
+      </w:r>
+      <w:r>
+        <w:t xml:space="preserve">was classified by stored rows)</w:t>
+      </w:r>
+    </w:p>
+    <w:p>
+      <w:pPr>
+        <w:pStyle w:val="Compact"/>
+        <w:numPr>
+          <w:ilvl w:val="1"/>
+          <w:numId w:val="1148"/>
+        </w:numPr>
+      </w:pPr>
+      <w:r>
+        <w:rPr>
+          <w:b/>
+          <w:bCs/>
+        </w:rPr>
+        <w:t xml:space="preserve">Blocked on:</w:t>
+      </w:r>
+      <w:r>
+        <w:t xml:space="preserve"> </w:t>
+      </w:r>
+      <w:r>
+        <w:t xml:space="preserve">no backlog-classification proof harness exists in-repo today (§11.4.275 forensic anchor clause (5), gate-code declared a separate work item)</w:t>
+      </w:r>
+    </w:p>
+    <w:p>
+      <w:pPr>
+        <w:pStyle w:val="Compact"/>
+        <w:numPr>
+          <w:ilvl w:val="1"/>
+          <w:numId w:val="1148"/>
+        </w:numPr>
+      </w:pPr>
+      <w:r>
+        <w:rPr>
+          <w:b/>
+          <w:bCs/>
+        </w:rPr>
+        <w:t xml:space="preserve">Paired §1.1 mutation:</w:t>
+      </w:r>
+      <w:r>
+        <w:t xml:space="preserve"> </w:t>
+      </w:r>
+      <w:r>
+        <w:t xml:space="preserve">owed together with the harness — per §11.4.115(F) observation-before-trust the gate is not trusted until a paired mutation has been OBSERVED to make it FAIL, and per §11.4.227(A) the row leaves the TSV and the baseline ratchets down only then.</w:t>
+      </w:r>
+    </w:p>
+    <w:p>
+      <w:pPr>
+        <w:pStyle w:val="Compact"/>
+        <w:numPr>
+          <w:ilvl w:val="0"/>
+          <w:numId w:val="1139"/>
+        </w:numPr>
+      </w:pPr>
+      <w:r>
+        <w:rPr>
+          <w:b/>
+          <w:bCs/>
+        </w:rPr>
+        <w:t xml:space="preserve">OWED-GATE-105</w:t>
+      </w:r>
+      <w:r>
+        <w:t xml:space="preserve"> </w:t>
+      </w:r>
+      <w:r>
+        <w:t xml:space="preserve">—</w:t>
+      </w:r>
+      <w:r>
+        <w:t xml:space="preserve"> </w:t>
+      </w:r>
+      <w:r>
+        <w:rPr>
+          <w:rStyle w:val="VerbatimChar"/>
+        </w:rPr>
+        <w:t xml:space="preserve">CM-CODEGRAPH-STALL-WATCHDOG</w:t>
+      </w:r>
+    </w:p>
+    <w:p>
+      <w:pPr>
+        <w:pStyle w:val="Compact"/>
+        <w:numPr>
+          <w:ilvl w:val="1"/>
+          <w:numId w:val="1149"/>
+        </w:numPr>
+      </w:pPr>
+      <w:r>
+        <w:rPr>
+          <w:b/>
+          <w:bCs/>
+        </w:rPr>
+        <w:t xml:space="preserve">Must assert:</w:t>
+      </w:r>
+      <w:r>
+        <w:t xml:space="preserve"> </w:t>
+      </w:r>
+      <w:r>
+        <w:t xml:space="preserve">asserts a long-running CodeGraph bulk operation emits a monotonic progress signal and a watchdog flags HUNG on no-advance past a declared no-progress budget —</w:t>
+      </w:r>
+      <w:r>
+        <w:t xml:space="preserve"> </w:t>
+      </w:r>
+      <w:r>
+        <w:rPr>
+          <w:rStyle w:val="VerbatimChar"/>
+        </w:rPr>
+        <w:t xml:space="preserve">kill -0</w:t>
+      </w:r>
+      <w:r>
+        <w:t xml:space="preserve">/process-alive is a necessary-not-sufficient pre-filter, never sufficient proof of progress (§11.4.201(6)–(7), §11.4.232(C))</w:t>
+      </w:r>
+    </w:p>
+    <w:p>
+      <w:pPr>
+        <w:pStyle w:val="Compact"/>
+        <w:numPr>
+          <w:ilvl w:val="1"/>
+          <w:numId w:val="1149"/>
+        </w:numPr>
+      </w:pPr>
+      <w:r>
+        <w:rPr>
+          <w:b/>
+          <w:bCs/>
+        </w:rPr>
+        <w:t xml:space="preserve">Blocked on:</w:t>
+      </w:r>
+      <w:r>
+        <w:t xml:space="preserve"> </w:t>
+      </w:r>
+      <w:r>
+        <w:t xml:space="preserve">no progress-heartbeat-plus-watchdog harness exists in-repo today (§11.4.232(C) cross-referenced by §11.4.275, gate-code declared a separate work item)</w:t>
+      </w:r>
+    </w:p>
+    <w:p>
+      <w:pPr>
+        <w:pStyle w:val="Compact"/>
+        <w:numPr>
+          <w:ilvl w:val="1"/>
+          <w:numId w:val="1149"/>
+        </w:numPr>
+      </w:pPr>
+      <w:r>
+        <w:rPr>
+          <w:b/>
+          <w:bCs/>
+        </w:rPr>
+        <w:t xml:space="preserve">Paired §1.1 mutation:</w:t>
+      </w:r>
+      <w:r>
+        <w:t xml:space="preserve"> </w:t>
+      </w:r>
+      <w:r>
+        <w:t xml:space="preserve">owed together with the harness — per §11.4.115(F) observation-before-trust the gate is not trusted until a paired mutation has been OBSERVED to make it FAIL, and per §11.4.227(A) the row leaves the TSV and the baseline ratchets down only then.</w:t>
+      </w:r>
+    </w:p>
     <w:bookmarkEnd w:id="62"/>
     <w:bookmarkEnd w:id="63"/>
+    <w:bookmarkEnd w:id="64"/>
     <w:sectPr>
       <w:footnotePr>
         <w:numRestart w:val="eachSect"/>
@@ -11942,6 +13015,39 @@
     <w:abstractNumId w:val="991"/>
   </w:num>
   <w:num w:numId="1138">
+    <w:abstractNumId w:val="991"/>
+  </w:num>
+  <w:num w:numId="1139">
+    <w:abstractNumId w:val="991"/>
+  </w:num>
+  <w:num w:numId="1140">
+    <w:abstractNumId w:val="991"/>
+  </w:num>
+  <w:num w:numId="1141">
+    <w:abstractNumId w:val="991"/>
+  </w:num>
+  <w:num w:numId="1142">
+    <w:abstractNumId w:val="991"/>
+  </w:num>
+  <w:num w:numId="1143">
+    <w:abstractNumId w:val="991"/>
+  </w:num>
+  <w:num w:numId="1144">
+    <w:abstractNumId w:val="991"/>
+  </w:num>
+  <w:num w:numId="1145">
+    <w:abstractNumId w:val="991"/>
+  </w:num>
+  <w:num w:numId="1146">
+    <w:abstractNumId w:val="991"/>
+  </w:num>
+  <w:num w:numId="1147">
+    <w:abstractNumId w:val="991"/>
+  </w:num>
+  <w:num w:numId="1148">
+    <w:abstractNumId w:val="991"/>
+  </w:num>
+  <w:num w:numId="1149">
     <w:abstractNumId w:val="991"/>
   </w:num>
 </w:numbering>

</xml_diff>

<commit_message>
docs(§11.4.230(E)): regenerate .html/.pdf/.docx twins for the 7 Markdown files touched by 02587b9
§11.4.106(E) twin regeneration, separate follow-up commit to the
§11.4.230(E) quick-delivery clause landing (02587b9), landed under the
operator-accepted §11.4.271 waiver ATM-1216 (operator decision
2026-10-13 16:51 +05, "we accept"; authoriser milos85vasic; expiry
2026-11-13, proposed/adjustable; tracked items ATM-1209..ATM-1212 =
N32..N35).

Regenerated with the parent repo's exporter:
  FC_TIMING=0 bash scripts/testing/sync_all_markdown_exports.sh \
    --regenerate-all --paths constitution/{Constitution,CLAUDE,AGENTS,
    QWEN,GEMINI}.md constitution/groups/multi-track-and-parallelism.md
    constitution/docs/owed_gate_implementations.md
  -> TARGETED MODE narrowed to 7 files; regenerated: 7 failed: 0.
Twins only; no Markdown, gate, index or ledger change.

Co-Authored-By: Claude Opus 5.5 <noreply@anthropic.com>
</commit_message>
<xml_diff>
--- a/docs/owed_gate_implementations.docx
+++ b/docs/owed_gate_implementations.docx
@@ -2,7 +2,7 @@
 <file path=word/document.xml><?xml version="1.0" encoding="utf-8"?>
 <w:document xmlns:w="http://schemas.openxmlformats.org/wordprocessingml/2006/main" xmlns:m="http://schemas.openxmlformats.org/officeDocument/2006/math" xmlns:r="http://schemas.openxmlformats.org/officeDocument/2006/relationships" xmlns:o="urn:schemas-microsoft-com:office:office" xmlns:v="urn:schemas-microsoft-com:vml" xmlns:w10="urn:schemas-microsoft-com:office:word" xmlns:a="http://schemas.openxmlformats.org/drawingml/2006/main" xmlns:pic="http://schemas.openxmlformats.org/drawingml/2006/picture" xmlns:wp="http://schemas.openxmlformats.org/drawingml/2006/wordprocessingDrawing">
   <w:body>
-    <w:bookmarkStart w:id="67" w:name="X84d0ab51813067a5056b404fa880c512cb5c295"/>
+    <w:bookmarkStart w:id="69" w:name="X84d0ab51813067a5056b404fa880c512cb5c295"/>
     <w:p>
       <w:pPr>
         <w:pStyle w:val="Heading1"/>
@@ -26,7 +26,7 @@
         <w:t xml:space="preserve"> </w:t>
       </w:r>
       <w:r>
-        <w:t xml:space="preserve">6</w:t>
+        <w:t xml:space="preserve">8</w:t>
       </w:r>
       <w:r>
         <w:t xml:space="preserve"> </w:t>
@@ -42,7 +42,7 @@
         <w:t xml:space="preserve"> </w:t>
       </w:r>
       <w:r>
-        <w:t xml:space="preserve">2026-10-05T09:59:56Z</w:t>
+        <w:t xml:space="preserve">2026-10-12T21:37:09Z</w:t>
       </w:r>
       <w:r>
         <w:t xml:space="preserve"> </w:t>
@@ -9524,7 +9524,7 @@
       </w:r>
     </w:p>
     <w:bookmarkEnd w:id="53"/>
-    <w:bookmarkStart w:id="66" w:name="Xe8f3817a6818fe082c945e3f92a1ba918863c38"/>
+    <w:bookmarkStart w:id="68" w:name="Xe8f3817a6818fe082c945e3f92a1ba918863c38"/>
     <w:p>
       <w:pPr>
         <w:pStyle w:val="Heading2"/>
@@ -13418,8 +13418,896 @@
       </w:r>
     </w:p>
     <w:bookmarkEnd w:id="65"/>
+    <w:bookmarkStart w:id="66" w:name="X4f770c5b179a062004fbfadd5af3119a95974d6"/>
+    <w:p>
+      <w:pPr>
+        <w:pStyle w:val="Heading3"/>
+      </w:pPr>
+      <w:r>
+        <w:t xml:space="preserve">§11.4.235(E) (registered 2026-10-09 — documented here 2026-10-12 as a currency fix; the TSV row predated this entry)</w:t>
+      </w:r>
+    </w:p>
+    <w:p>
+      <w:pPr>
+        <w:pStyle w:val="Compact"/>
+        <w:numPr>
+          <w:ilvl w:val="0"/>
+          <w:numId w:val="1161"/>
+        </w:numPr>
+      </w:pPr>
+      <w:r>
+        <w:rPr>
+          <w:b/>
+          <w:bCs/>
+        </w:rPr>
+        <w:t xml:space="preserve">OWED-GATE-114</w:t>
+      </w:r>
+      <w:r>
+        <w:t xml:space="preserve"> </w:t>
+      </w:r>
+      <w:r>
+        <w:t xml:space="preserve">—</w:t>
+      </w:r>
+      <w:r>
+        <w:t xml:space="preserve"> </w:t>
+      </w:r>
+      <w:r>
+        <w:rPr>
+          <w:rStyle w:val="VerbatimChar"/>
+        </w:rPr>
+        <w:t xml:space="preserve">CM-GROUP-DEPLOY-FLASH-ALL-AND-LIVE-VERIFIED</w:t>
+      </w:r>
+    </w:p>
+    <w:p>
+      <w:pPr>
+        <w:pStyle w:val="Compact"/>
+        <w:numPr>
+          <w:ilvl w:val="1"/>
+          <w:numId w:val="1162"/>
+        </w:numPr>
+      </w:pPr>
+      <w:r>
+        <w:rPr>
+          <w:b/>
+          <w:bCs/>
+        </w:rPr>
+        <w:t xml:space="preserve">Must assert:</w:t>
+      </w:r>
+      <w:r>
+        <w:t xml:space="preserve"> </w:t>
+      </w:r>
+      <w:r>
+        <w:t xml:space="preserve">see the TSV row (per-group flash of every available, eligible, leased target with §11.4.200 read-back, sanity and per-item live verdicts; DEFERRED for leased devices; zero-device run never PASS)</w:t>
+      </w:r>
+    </w:p>
+    <w:p>
+      <w:pPr>
+        <w:pStyle w:val="Compact"/>
+        <w:numPr>
+          <w:ilvl w:val="1"/>
+          <w:numId w:val="1162"/>
+        </w:numPr>
+      </w:pPr>
+      <w:r>
+        <w:rPr>
+          <w:b/>
+          <w:bCs/>
+        </w:rPr>
+        <w:t xml:space="preserve">Blocked on:</w:t>
+      </w:r>
+      <w:r>
+        <w:t xml:space="preserve"> </w:t>
+      </w:r>
+      <w:r>
+        <w:t xml:space="preserve">no deploy-record/enumeration reconciliation harness exists in-repo (§11.4.235(E), gate-code declared a separate work item)</w:t>
+      </w:r>
+    </w:p>
+    <w:p>
+      <w:pPr>
+        <w:pStyle w:val="Compact"/>
+        <w:numPr>
+          <w:ilvl w:val="1"/>
+          <w:numId w:val="1162"/>
+        </w:numPr>
+      </w:pPr>
+      <w:r>
+        <w:rPr>
+          <w:b/>
+          <w:bCs/>
+        </w:rPr>
+        <w:t xml:space="preserve">Paired §1.1 mutation:</w:t>
+      </w:r>
+      <w:r>
+        <w:t xml:space="preserve"> </w:t>
+      </w:r>
+      <w:r>
+        <w:t xml:space="preserve">owed together with the harness — per §11.4.115(F) observation-before-trust the gate is not trusted until a paired mutation has been OBSERVED to make it FAIL.</w:t>
+      </w:r>
+    </w:p>
+    <w:p>
+      <w:pPr>
+        <w:pStyle w:val="FirstParagraph"/>
+      </w:pPr>
+      <w:r>
+        <w:rPr>
+          <w:b/>
+          <w:bCs/>
+        </w:rPr>
+        <w:t xml:space="preserve">Ratchet baseline policy (round 3 of §11.4.230(E), 2026-10-12; review finding N7).</w:t>
+      </w:r>
+      <w:r>
+        <w:t xml:space="preserve"> </w:t>
+      </w:r>
+      <w:r>
+        <w:rPr>
+          <w:rStyle w:val="VerbatimChar"/>
+        </w:rPr>
+        <w:t xml:space="preserve">scripts/gates/gate_ledger_baseline.txt</w:t>
+      </w:r>
+      <w:r>
+        <w:t xml:space="preserve"> </w:t>
+      </w:r>
+      <w:r>
+        <w:t xml:space="preserve">was lowered from 402 to 394, the measured unimplemented count, in the same change that registered OWED-GATE-115..120 (the 8 points of headroom predated that change; §11.4.227(A) is monotone, so lowering is always allowed). Sub-case T6 of</w:t>
+      </w:r>
+      <w:r>
+        <w:t xml:space="preserve"> </w:t>
+      </w:r>
+      <w:r>
+        <w:rPr>
+          <w:rStyle w:val="VerbatimChar"/>
+        </w:rPr>
+        <w:t xml:space="preserve">scripts/gates/cm_gate_ledger_ratchet_mutation_test.sh</w:t>
+      </w:r>
+      <w:r>
+        <w:t xml:space="preserve"> </w:t>
+      </w:r>
+      <w:r>
+        <w:t xml:space="preserve">runs the ratchet on the REAL corpus, deferrals and checked-in baseline, deletes one real deferral row, and requires</w:t>
+      </w:r>
+      <w:r>
+        <w:t xml:space="preserve"> </w:t>
+      </w:r>
+      <w:r>
+        <w:rPr>
+          <w:rStyle w:val="VerbatimChar"/>
+        </w:rPr>
+        <w:t xml:space="preserve">ratchet violated</w:t>
+      </w:r>
+      <w:r>
+        <w:t xml:space="preserve">. T6 therefore enforces ZERO HEADROOM: the checked-in baseline must equal the measured count. This is stricter than §11.4.227(A)'s monotone rule, on purpose: with any headroom, deleting a deferral row (silent gate debt) passes the ratchet. The consequence for every later change: whoever implements a gate, or retires a deferral row, MUST lower the baseline in the same commit, or T6 fails.</w:t>
+      </w:r>
+    </w:p>
     <w:bookmarkEnd w:id="66"/>
+    <w:bookmarkStart w:id="67" w:name="Xde0e4d36893b04fa7784476cd876860e7af5245"/>
+    <w:p>
+      <w:pPr>
+        <w:pStyle w:val="Heading3"/>
+      </w:pPr>
+      <w:r>
+        <w:t xml:space="preserve">§11.4.230(E) (registered 2026-10-12 — operator CRITICAL mandate: quick visible results, hardening tracked to production readiness)</w:t>
+      </w:r>
+    </w:p>
+    <w:p>
+      <w:pPr>
+        <w:pStyle w:val="Compact"/>
+        <w:numPr>
+          <w:ilvl w:val="0"/>
+          <w:numId w:val="1163"/>
+        </w:numPr>
+      </w:pPr>
+      <w:r>
+        <w:rPr>
+          <w:b/>
+          <w:bCs/>
+        </w:rPr>
+        <w:t xml:space="preserve">OWED-GATE-115</w:t>
+      </w:r>
+      <w:r>
+        <w:t xml:space="preserve"> </w:t>
+      </w:r>
+      <w:r>
+        <w:t xml:space="preserve">—</w:t>
+      </w:r>
+      <w:r>
+        <w:t xml:space="preserve"> </w:t>
+      </w:r>
+      <w:r>
+        <w:rPr>
+          <w:rStyle w:val="VerbatimChar"/>
+        </w:rPr>
+        <w:t xml:space="preserve">CM-DELIVERY-HARDENING-STATUS-COMPUTED</w:t>
+      </w:r>
+    </w:p>
+    <w:p>
+      <w:pPr>
+        <w:pStyle w:val="Compact"/>
+        <w:numPr>
+          <w:ilvl w:val="1"/>
+          <w:numId w:val="1164"/>
+        </w:numPr>
+      </w:pPr>
+      <w:r>
+        <w:rPr>
+          <w:b/>
+          <w:bCs/>
+        </w:rPr>
+        <w:t xml:space="preserve">Must assert:</w:t>
+      </w:r>
+      <w:r>
+        <w:t xml:space="preserve"> </w:t>
+      </w:r>
+      <w:r>
+        <w:t xml:space="preserve">every QA hand-off record carries a hardening status from the closed set {delivered-unhardened|delivered-hardened-awaiting-qa|production-ready} and a pending field from its closed set, both equal to the first-match transition-table value recomputed from the read-only open-hardening-ledger join (inputs: unresolvable input, open count, §11.4.185 confirmation, release-seam record, not-fingerprint-bound store); production-ready never without the release-seam record, the §11.4.185 confirmation, zero open entries and no not-fingerprint-bound input; the release seam never records a pass while entries are open or before the confirmation; unresolvable input resolved downward; a §11.4.185 confirmation counted only if its stream sequence number exceeds that of every ledger record for the fingerprint and a release-seam record only if its sequence number exceeds that of the latest confirmation (round 3: a reopen-then-re-close replay after the seam record MUST NOT reach production-ready without a new confirmation and seam record); pending computed from the inputs (never naming an act whose valid record exists); the status independent of record storage order; (round 4) the entry set is the ledger join over every declared owning store UNION every entry id named by any disposition record for the fingerprint, so an entry whose store row was deleted while its latest record is open MUST NOT reach production-ready; any unreadable declared owning store, required or not, is an unresolvable input; a record counts only for the one fingerprint it carries, never inherited; (round 5) the status reads only the FIELD TABLE fields (F1)-(F12): an entry id matched in more than one row, or in rows of different classes, is an unresolvable input and is never resolved by store declaration order or by a record, the status is unchanged when the owning stores are declared in another order, the inputs are the records carrying the fingerprint except the whole-stream sequence-number check of X, and only an entry's latest record can open it; (round 6) the gate's status function takes ONE typed input record whose field-by-field projection is byte-identical to the clause's FIELD TABLE, reads nothing that is not a field of it, and reads every field of it; a matched row with no</w:t>
+      </w:r>
+      <w:r>
+        <w:t xml:space="preserve"> </w:t>
+      </w:r>
+      <w:r>
+        <w:rPr>
+          <w:rStyle w:val="VerbatimChar"/>
+        </w:rPr>
+        <w:t xml:space="preserve">birth</w:t>
+      </w:r>
+      <w:r>
+        <w:t xml:space="preserve"> </w:t>
+      </w:r>
+      <w:r>
+        <w:t xml:space="preserve">write-log entry for the fingerprint, or a write-log entry whose mirror record is missing, is an unresolvable input; a status counting a</w:t>
+      </w:r>
+      <w:r>
+        <w:t xml:space="preserve"> </w:t>
+      </w:r>
+      <w:r>
+        <w:rPr>
+          <w:rStyle w:val="VerbatimChar"/>
+        </w:rPr>
+        <w:t xml:space="preserve">waived</w:t>
+      </w:r>
+      <w:r>
+        <w:t xml:space="preserve"> </w:t>
+      </w:r>
+      <w:r>
+        <w:t xml:space="preserve">entry carries the earliest such waiver expiry as its VALID-UNTIL and is recomputed at it; a sequence defect holds only the fingerprints of the records involved in it, and a quarantine without a recorded §11.4.66 decision quarantines nothing; (round 7) every field of that input record may be absent and each absence takes exactly the outcome its ABSENT cell names, proven field by field (a missing write-log fingerprint, required flag, store declaration list or log entry id is an unresolvable input; a decided repair with no positions quarantines nothing; a</w:t>
+      </w:r>
+      <w:r>
+        <w:t xml:space="preserve"> </w:t>
+      </w:r>
+      <w:r>
+        <w:rPr>
+          <w:rStyle w:val="VerbatimChar"/>
+        </w:rPr>
+        <w:t xml:space="preserve">disposition</w:t>
+      </w:r>
+      <w:r>
+        <w:t xml:space="preserve"> </w:t>
+      </w:r>
+      <w:r>
+        <w:t xml:space="preserve">record with no entry names no entry); a write-log mirror is accepted only when it is an in-scope record (a mirror of another fingerprint, or a quarantined one, is an unresolvable input); the closure test that binds the gate's status function resolves names per scope, admits only literal rule tables and</w:t>
+      </w:r>
+      <w:r>
+        <w:t xml:space="preserve"> </w:t>
+      </w:r>
+      <w:r>
+        <w:rPr>
+          <w:rStyle w:val="VerbatimChar"/>
+        </w:rPr>
+        <w:t xml:space="preserve">def status</w:t>
+      </w:r>
+      <w:r>
+        <w:t xml:space="preserve"> </w:t>
+      </w:r>
+      <w:r>
+        <w:t xml:space="preserve">at module level, refuses a rebound builtin, a default value or a closure over a non-parameter, and probes a fresh import with the clock, environment and builtins instrumented; and the §11.4.259 gauge never GREEN over an unhardened/stale/unknown newest deliverable</w:t>
+      </w:r>
+    </w:p>
+    <w:p>
+      <w:pPr>
+        <w:pStyle w:val="Compact"/>
+        <w:numPr>
+          <w:ilvl w:val="1"/>
+          <w:numId w:val="1164"/>
+        </w:numPr>
+      </w:pPr>
+      <w:r>
+        <w:rPr>
+          <w:b/>
+          <w:bCs/>
+        </w:rPr>
+        <w:t xml:space="preserve">Blocked on:</w:t>
+      </w:r>
+      <w:r>
+        <w:t xml:space="preserve"> </w:t>
+      </w:r>
+      <w:r>
+        <w:t xml:space="preserve">no hand-off-record status recomputation harness exists in-repo (§11.4.230(E), gate-code declared a separate work item)</w:t>
+      </w:r>
+    </w:p>
+    <w:p>
+      <w:pPr>
+        <w:pStyle w:val="Compact"/>
+        <w:numPr>
+          <w:ilvl w:val="1"/>
+          <w:numId w:val="1164"/>
+        </w:numPr>
+      </w:pPr>
+      <w:r>
+        <w:rPr>
+          <w:b/>
+          <w:bCs/>
+        </w:rPr>
+        <w:t xml:space="preserve">Paired §1.1 mutation:</w:t>
+      </w:r>
+      <w:r>
+        <w:t xml:space="preserve"> </w:t>
+      </w:r>
+      <w:r>
+        <w:t xml:space="preserve">owed together with the harness — per §11.4.115(F) observation-before-trust the gate is not trusted until a paired mutation has been OBSERVED to make it FAIL, and per §11.4.227(A) the row leaves the TSV only when the gate is implemented.</w:t>
+      </w:r>
+    </w:p>
+    <w:p>
+      <w:pPr>
+        <w:pStyle w:val="Compact"/>
+        <w:numPr>
+          <w:ilvl w:val="0"/>
+          <w:numId w:val="1163"/>
+        </w:numPr>
+      </w:pPr>
+      <w:r>
+        <w:rPr>
+          <w:b/>
+          <w:bCs/>
+        </w:rPr>
+        <w:t xml:space="preserve">OWED-GATE-116</w:t>
+      </w:r>
+      <w:r>
+        <w:t xml:space="preserve"> </w:t>
+      </w:r>
+      <w:r>
+        <w:t xml:space="preserve">—</w:t>
+      </w:r>
+      <w:r>
+        <w:t xml:space="preserve"> </w:t>
+      </w:r>
+      <w:r>
+        <w:rPr>
+          <w:rStyle w:val="VerbatimChar"/>
+        </w:rPr>
+        <w:t xml:space="preserve">CM-DELIVERY-STATUS-FRESH</w:t>
+      </w:r>
+    </w:p>
+    <w:p>
+      <w:pPr>
+        <w:pStyle w:val="Compact"/>
+        <w:numPr>
+          <w:ilvl w:val="1"/>
+          <w:numId w:val="1165"/>
+        </w:numPr>
+      </w:pPr>
+      <w:r>
+        <w:rPr>
+          <w:b/>
+          <w:bCs/>
+        </w:rPr>
+        <w:t xml:space="preserve">Must assert:</w:t>
+      </w:r>
+      <w:r>
+        <w:t xml:space="preserve"> </w:t>
+      </w:r>
+      <w:r>
+        <w:t xml:space="preserve">every announced delivery status carries its fingerprint and ledger-snapshot time and was computed after the latest write to every matching record of every owning store (fingerprint-keyed stores: records for the fingerprint; scope-keyed stores: records for the contained items and code paths), and every owning store declares its keying class, a store that can supply neither carrying an explicit not-fingerprint-bound label; FAILs on a missing fingerprint/snapshot time, a fingerprint mismatch, a snapshot older than a matching write, an undeclared keying class, or (round 4) a scope-keyed write not mirrored to every already-delivered fingerprint whose hand-off record names a matching contained item or code path</w:t>
+      </w:r>
+    </w:p>
+    <w:p>
+      <w:pPr>
+        <w:pStyle w:val="Compact"/>
+        <w:numPr>
+          <w:ilvl w:val="1"/>
+          <w:numId w:val="1165"/>
+        </w:numPr>
+      </w:pPr>
+      <w:r>
+        <w:rPr>
+          <w:b/>
+          <w:bCs/>
+        </w:rPr>
+        <w:t xml:space="preserve">Blocked on:</w:t>
+      </w:r>
+      <w:r>
+        <w:t xml:space="preserve"> </w:t>
+      </w:r>
+      <w:r>
+        <w:t xml:space="preserve">no owning-store write-time index exists in-repo (§11.4.230(E), gate-code declared a separate work item)</w:t>
+      </w:r>
+    </w:p>
+    <w:p>
+      <w:pPr>
+        <w:pStyle w:val="Compact"/>
+        <w:numPr>
+          <w:ilvl w:val="1"/>
+          <w:numId w:val="1165"/>
+        </w:numPr>
+      </w:pPr>
+      <w:r>
+        <w:rPr>
+          <w:b/>
+          <w:bCs/>
+        </w:rPr>
+        <w:t xml:space="preserve">Paired §1.1 mutation:</w:t>
+      </w:r>
+      <w:r>
+        <w:t xml:space="preserve"> </w:t>
+      </w:r>
+      <w:r>
+        <w:t xml:space="preserve">owed together with the harness — per §11.4.115(F) observation-before-trust the gate is not trusted until a paired mutation has been OBSERVED to make it FAIL, and per §11.4.227(A) the row leaves the TSV only when the gate is implemented.</w:t>
+      </w:r>
+    </w:p>
+    <w:p>
+      <w:pPr>
+        <w:pStyle w:val="Compact"/>
+        <w:numPr>
+          <w:ilvl w:val="0"/>
+          <w:numId w:val="1163"/>
+        </w:numPr>
+      </w:pPr>
+      <w:r>
+        <w:rPr>
+          <w:b/>
+          <w:bCs/>
+        </w:rPr>
+        <w:t xml:space="preserve">OWED-GATE-117</w:t>
+      </w:r>
+      <w:r>
+        <w:t xml:space="preserve"> </w:t>
+      </w:r>
+      <w:r>
+        <w:t xml:space="preserve">—</w:t>
+      </w:r>
+      <w:r>
+        <w:t xml:space="preserve"> </w:t>
+      </w:r>
+      <w:r>
+        <w:rPr>
+          <w:rStyle w:val="VerbatimChar"/>
+        </w:rPr>
+        <w:t xml:space="preserve">CM-HARDENING-LEDGER-TRACKED</w:t>
+      </w:r>
+    </w:p>
+    <w:p>
+      <w:pPr>
+        <w:pStyle w:val="Compact"/>
+        <w:numPr>
+          <w:ilvl w:val="1"/>
+          <w:numId w:val="1166"/>
+        </w:numPr>
+      </w:pPr>
+      <w:r>
+        <w:rPr>
+          <w:b/>
+          <w:bCs/>
+        </w:rPr>
+        <w:t xml:space="preserve">Must assert:</w:t>
+      </w:r>
+      <w:r>
+        <w:t xml:space="preserve"> </w:t>
+      </w:r>
+      <w:r>
+        <w:t xml:space="preserve">the open hardening ledger is a read-only join over the owning stores (never a hand-maintained store) over the closed entry classes L1..L8 of §11.4.230(E.3)(b), every entry carries a tracked §11.4.197 item id and a disposition from {open|closed|skipped|not-applicable|waived} that is inside its class's permitted-disposition row of §11.4.230(E.3)(b) (round 3: L7 and L6 never skipped or waived, L3/L4/L5 never skipped), every non-open disposition record carries writer role verifier-seam (producer≠verifier §11.4.240/§11.4.249), skipped reasons are only hardware_not_present or topology_unsupported, (round 4) every reason code is inside its disposition's closed permitted-code row (open: open-debt; closed: closing-evidence with an evidence reference; skipped: the two topology-absent codes; not-applicable: feature_disabled_by_config; waived: waiver with an evidence reference naming the waiver), every validity check uses the entry's class from its owning-store row and a record whose class label differs from it is invalid, (round 5) every absence-defined (L1, L2, L6, L7) and polish (L5) entry has its tracked-item row, created when the join first matches it and never removed, so a valid skipped or not-applicable record resolves it, (round 6) creating an entry's row and every hand-off are mirrored as</w:t>
+      </w:r>
+      <w:r>
+        <w:t xml:space="preserve"> </w:t>
+      </w:r>
+      <w:r>
+        <w:rPr>
+          <w:rStyle w:val="VerbatimChar"/>
+        </w:rPr>
+        <w:t xml:space="preserve">open</w:t>
+      </w:r>
+      <w:r>
+        <w:t xml:space="preserve"> </w:t>
+      </w:r>
+      <w:r>
+        <w:t xml:space="preserve">birth records so a later row deletion never drops the entry, (round 7) a scope-keyed row's scope and every contained path are compared in the (V3a) normalised form, segment by segment and case-sensitively, and the row joins a contained path it equals, is an ancestor of or is a descendant of, while a scope or contained path that does not normalise is an unresolvable input and never silently left out of the join, waived entries hold a valid §11.4.271 waiver, resolved-but-disclosed entries appear in every announcement's counts, and every contained item without a passing §11.4.235(E.3) live verdict on the fingerprint appears in it</w:t>
+      </w:r>
+    </w:p>
+    <w:p>
+      <w:pPr>
+        <w:pStyle w:val="Compact"/>
+        <w:numPr>
+          <w:ilvl w:val="1"/>
+          <w:numId w:val="1166"/>
+        </w:numPr>
+      </w:pPr>
+      <w:r>
+        <w:rPr>
+          <w:b/>
+          <w:bCs/>
+        </w:rPr>
+        <w:t xml:space="preserve">Blocked on:</w:t>
+      </w:r>
+      <w:r>
+        <w:t xml:space="preserve"> </w:t>
+      </w:r>
+      <w:r>
+        <w:t xml:space="preserve">no ledger-join implementation exists in-repo (§11.4.230(E), gate-code declared a separate work item)</w:t>
+      </w:r>
+    </w:p>
+    <w:p>
+      <w:pPr>
+        <w:pStyle w:val="Compact"/>
+        <w:numPr>
+          <w:ilvl w:val="1"/>
+          <w:numId w:val="1166"/>
+        </w:numPr>
+      </w:pPr>
+      <w:r>
+        <w:rPr>
+          <w:b/>
+          <w:bCs/>
+        </w:rPr>
+        <w:t xml:space="preserve">Paired §1.1 mutation:</w:t>
+      </w:r>
+      <w:r>
+        <w:t xml:space="preserve"> </w:t>
+      </w:r>
+      <w:r>
+        <w:t xml:space="preserve">owed together with the harness — per §11.4.115(F) observation-before-trust the gate is not trusted until a paired mutation has been OBSERVED to make it FAIL, and per §11.4.227(A) the row leaves the TSV only when the gate is implemented.</w:t>
+      </w:r>
+    </w:p>
+    <w:p>
+      <w:pPr>
+        <w:pStyle w:val="Compact"/>
+        <w:numPr>
+          <w:ilvl w:val="0"/>
+          <w:numId w:val="1163"/>
+        </w:numPr>
+      </w:pPr>
+      <w:r>
+        <w:rPr>
+          <w:b/>
+          <w:bCs/>
+        </w:rPr>
+        <w:t xml:space="preserve">OWED-GATE-118</w:t>
+      </w:r>
+      <w:r>
+        <w:t xml:space="preserve"> </w:t>
+      </w:r>
+      <w:r>
+        <w:t xml:space="preserve">—</w:t>
+      </w:r>
+      <w:r>
+        <w:t xml:space="preserve"> </w:t>
+      </w:r>
+      <w:r>
+        <w:rPr>
+          <w:rStyle w:val="VerbatimChar"/>
+        </w:rPr>
+        <w:t xml:space="preserve">CM-HARDENING-CONVERGENCE-MONOTONE</w:t>
+      </w:r>
+    </w:p>
+    <w:p>
+      <w:pPr>
+        <w:pStyle w:val="Compact"/>
+        <w:numPr>
+          <w:ilvl w:val="1"/>
+          <w:numId w:val="1167"/>
+        </w:numPr>
+      </w:pPr>
+      <w:r>
+        <w:rPr>
+          <w:b/>
+          <w:bCs/>
+        </w:rPr>
+        <w:t xml:space="preserve">Must assert:</w:t>
+      </w:r>
+      <w:r>
+        <w:t xml:space="preserve"> </w:t>
+      </w:r>
+      <w:r>
+        <w:t xml:space="preserve">per-scope convergence records exist per cadence build; FAILs on open-count growth not explained by new increments, N consecutive no-new-increment deliverables without decrease and without a §11.4.267(D) escalation record, a bound scope with no declared N, open entries with zero live hardening streams while host headroom exists, or a §11.4.126 loop reported done while a delivered scope of the current release has open entries and no recorded external block (a scope at delivered-hardened-awaiting-qa pending only manual-qa or release-seam is a recorded external block that never idles the loop)</w:t>
+      </w:r>
+    </w:p>
+    <w:p>
+      <w:pPr>
+        <w:pStyle w:val="Compact"/>
+        <w:numPr>
+          <w:ilvl w:val="1"/>
+          <w:numId w:val="1167"/>
+        </w:numPr>
+      </w:pPr>
+      <w:r>
+        <w:rPr>
+          <w:b/>
+          <w:bCs/>
+        </w:rPr>
+        <w:t xml:space="preserve">Blocked on:</w:t>
+      </w:r>
+      <w:r>
+        <w:t xml:space="preserve"> </w:t>
+      </w:r>
+      <w:r>
+        <w:t xml:space="preserve">no convergence-record consumer exists in-repo (§11.4.230(E), gate-code declared a separate work item)</w:t>
+      </w:r>
+    </w:p>
+    <w:p>
+      <w:pPr>
+        <w:pStyle w:val="Compact"/>
+        <w:numPr>
+          <w:ilvl w:val="1"/>
+          <w:numId w:val="1167"/>
+        </w:numPr>
+      </w:pPr>
+      <w:r>
+        <w:rPr>
+          <w:b/>
+          <w:bCs/>
+        </w:rPr>
+        <w:t xml:space="preserve">Paired §1.1 mutation:</w:t>
+      </w:r>
+      <w:r>
+        <w:t xml:space="preserve"> </w:t>
+      </w:r>
+      <w:r>
+        <w:t xml:space="preserve">owed together with the harness — per §11.4.115(F) observation-before-trust the gate is not trusted until a paired mutation has been OBSERVED to make it FAIL, and per §11.4.227(A) the row leaves the TSV only when the gate is implemented.</w:t>
+      </w:r>
+    </w:p>
+    <w:p>
+      <w:pPr>
+        <w:pStyle w:val="Compact"/>
+        <w:numPr>
+          <w:ilvl w:val="0"/>
+          <w:numId w:val="1163"/>
+        </w:numPr>
+      </w:pPr>
+      <w:r>
+        <w:rPr>
+          <w:b/>
+          <w:bCs/>
+        </w:rPr>
+        <w:t xml:space="preserve">OWED-GATE-119</w:t>
+      </w:r>
+      <w:r>
+        <w:t xml:space="preserve"> </w:t>
+      </w:r>
+      <w:r>
+        <w:t xml:space="preserve">—</w:t>
+      </w:r>
+      <w:r>
+        <w:t xml:space="preserve"> </w:t>
+      </w:r>
+      <w:r>
+        <w:rPr>
+          <w:rStyle w:val="VerbatimChar"/>
+        </w:rPr>
+        <w:t xml:space="preserve">CM-QUICK-DELIVERY-EVIDENCE-UNWEAKENED</w:t>
+      </w:r>
+    </w:p>
+    <w:p>
+      <w:pPr>
+        <w:pStyle w:val="Compact"/>
+        <w:numPr>
+          <w:ilvl w:val="1"/>
+          <w:numId w:val="1168"/>
+        </w:numPr>
+      </w:pPr>
+      <w:r>
+        <w:rPr>
+          <w:b/>
+          <w:bCs/>
+        </w:rPr>
+        <w:t xml:space="preserve">Must assert:</w:t>
+      </w:r>
+      <w:r>
+        <w:t xml:space="preserve"> </w:t>
+      </w:r>
+      <w:r>
+        <w:t xml:space="preserve">every quick hand-off carries the §11.4.236 candidate-fingerprinted verdict, a source GO recorded on the §11.4.209 substrate or its sanctioned recorded fallback, machine §11.4.235(E) per-item verdicts (never narrative), a status and ledger, and a first deliverable containing a source-GO'd increment exercising a user-visible behaviour</w:t>
+      </w:r>
+    </w:p>
+    <w:p>
+      <w:pPr>
+        <w:pStyle w:val="Compact"/>
+        <w:numPr>
+          <w:ilvl w:val="1"/>
+          <w:numId w:val="1168"/>
+        </w:numPr>
+      </w:pPr>
+      <w:r>
+        <w:rPr>
+          <w:b/>
+          <w:bCs/>
+        </w:rPr>
+        <w:t xml:space="preserve">Blocked on:</w:t>
+      </w:r>
+      <w:r>
+        <w:t xml:space="preserve"> </w:t>
+      </w:r>
+      <w:r>
+        <w:t xml:space="preserve">no hand-off evidence-completeness harness exists in-repo (§11.4.230(E), gate-code declared a separate work item)</w:t>
+      </w:r>
+    </w:p>
+    <w:p>
+      <w:pPr>
+        <w:pStyle w:val="Compact"/>
+        <w:numPr>
+          <w:ilvl w:val="1"/>
+          <w:numId w:val="1168"/>
+        </w:numPr>
+      </w:pPr>
+      <w:r>
+        <w:rPr>
+          <w:b/>
+          <w:bCs/>
+        </w:rPr>
+        <w:t xml:space="preserve">Paired §1.1 mutation:</w:t>
+      </w:r>
+      <w:r>
+        <w:t xml:space="preserve"> </w:t>
+      </w:r>
+      <w:r>
+        <w:t xml:space="preserve">owed together with the harness — per §11.4.115(F) observation-before-trust the gate is not trusted until a paired mutation has been OBSERVED to make it FAIL, and per §11.4.227(A) the row leaves the TSV only when the gate is implemented.</w:t>
+      </w:r>
+    </w:p>
+    <w:p>
+      <w:pPr>
+        <w:pStyle w:val="Compact"/>
+        <w:numPr>
+          <w:ilvl w:val="0"/>
+          <w:numId w:val="1163"/>
+        </w:numPr>
+      </w:pPr>
+      <w:r>
+        <w:rPr>
+          <w:b/>
+          <w:bCs/>
+        </w:rPr>
+        <w:t xml:space="preserve">OWED-GATE-120</w:t>
+      </w:r>
+      <w:r>
+        <w:t xml:space="preserve"> </w:t>
+      </w:r>
+      <w:r>
+        <w:t xml:space="preserve">—</w:t>
+      </w:r>
+      <w:r>
+        <w:t xml:space="preserve"> </w:t>
+      </w:r>
+      <w:r>
+        <w:rPr>
+          <w:rStyle w:val="VerbatimChar"/>
+        </w:rPr>
+        <w:t xml:space="preserve">CM-CANONICAL-MIRROR-BODY-LOCKSTEP</w:t>
+      </w:r>
+    </w:p>
+    <w:p>
+      <w:pPr>
+        <w:pStyle w:val="Compact"/>
+        <w:numPr>
+          <w:ilvl w:val="1"/>
+          <w:numId w:val="1169"/>
+        </w:numPr>
+      </w:pPr>
+      <w:r>
+        <w:rPr>
+          <w:b/>
+          <w:bCs/>
+        </w:rPr>
+        <w:t xml:space="preserve">Must assert:</w:t>
+      </w:r>
+      <w:r>
+        <w:t xml:space="preserve"> </w:t>
+      </w:r>
+      <w:r>
+        <w:t xml:space="preserve">for every anchor whose mirrors carry the FULL block (not a compact or pointer form), the canonical</w:t>
+      </w:r>
+      <w:r>
+        <w:t xml:space="preserve"> </w:t>
+      </w:r>
+      <w:r>
+        <w:rPr>
+          <w:rStyle w:val="VerbatimChar"/>
+        </w:rPr>
+        <w:t xml:space="preserve">Constitution.md</w:t>
+      </w:r>
+      <w:r>
+        <w:t xml:space="preserve"> </w:t>
+      </w:r>
+      <w:r>
+        <w:t xml:space="preserve">block body, heading marker normalised, is byte-identical to every full-block mirror body; compact/pointer mirrors are legitimate cross-layer variance (§11.4.227(B)) and never fire. Named golden-BAD fixtures (round 3): (i) a canonical-only edit followed by regeneration (round-1 mutation 7; round-2 D2, D3, D8) and (ii) the same edit applied consistently to every full-block mirror while</w:t>
+      </w:r>
+      <w:r>
+        <w:t xml:space="preserve"> </w:t>
+      </w:r>
+      <w:r>
+        <w:rPr>
+          <w:rStyle w:val="VerbatimChar"/>
+        </w:rPr>
+        <w:t xml:space="preserve">Constitution.md</w:t>
+      </w:r>
+      <w:r>
+        <w:t xml:space="preserve"> </w:t>
+      </w:r>
+      <w:r>
+        <w:t xml:space="preserve">is untouched (round-2 D6); both pass every existing gate today and MUST FAIL this one.</w:t>
+      </w:r>
+    </w:p>
+    <w:p>
+      <w:pPr>
+        <w:pStyle w:val="Compact"/>
+        <w:numPr>
+          <w:ilvl w:val="1"/>
+          <w:numId w:val="1169"/>
+        </w:numPr>
+      </w:pPr>
+      <w:r>
+        <w:rPr>
+          <w:b/>
+          <w:bCs/>
+        </w:rPr>
+        <w:t xml:space="preserve">Blocked on:</w:t>
+      </w:r>
+      <w:r>
+        <w:t xml:space="preserve"> </w:t>
+      </w:r>
+      <w:r>
+        <w:t xml:space="preserve">the shared</w:t>
+      </w:r>
+      <w:r>
+        <w:t xml:space="preserve"> </w:t>
+      </w:r>
+      <w:r>
+        <w:rPr>
+          <w:rStyle w:val="VerbatimChar"/>
+        </w:rPr>
+        <w:t xml:space="preserve">covenant_propagation_engine.sh</w:t>
+      </w:r>
+      <w:r>
+        <w:t xml:space="preserve"> </w:t>
+      </w:r>
+      <w:r>
+        <w:t xml:space="preserve">compares carriers with each other only; widening it touches every anchor's propagation gate and needs its own review (§11.4.230(E), gate-code declared a separate work item). Found by the round-1 independent review (mutation 7: a canonical-only edit followed by regeneration passed every gate).</w:t>
+      </w:r>
+    </w:p>
+    <w:p>
+      <w:pPr>
+        <w:pStyle w:val="Compact"/>
+        <w:numPr>
+          <w:ilvl w:val="1"/>
+          <w:numId w:val="1169"/>
+        </w:numPr>
+      </w:pPr>
+      <w:r>
+        <w:rPr>
+          <w:b/>
+          <w:bCs/>
+        </w:rPr>
+        <w:t xml:space="preserve">Paired §1.1 mutation:</w:t>
+      </w:r>
+      <w:r>
+        <w:t xml:space="preserve"> </w:t>
+      </w:r>
+      <w:r>
+        <w:t xml:space="preserve">owed together with the gate — edit the §11.4.230 body in</w:t>
+      </w:r>
+      <w:r>
+        <w:t xml:space="preserve"> </w:t>
+      </w:r>
+      <w:r>
+        <w:rPr>
+          <w:rStyle w:val="VerbatimChar"/>
+        </w:rPr>
+        <w:t xml:space="preserve">Constitution.md</w:t>
+      </w:r>
+      <w:r>
+        <w:t xml:space="preserve"> </w:t>
+      </w:r>
+      <w:r>
+        <w:t xml:space="preserve">only, regenerate, and the gate MUST FAIL; edit it in every full-block mirror only, and the gate MUST FAIL; per §11.4.227(A) the row leaves the TSV only when the gate is implemented.</w:t>
+      </w:r>
+    </w:p>
     <w:bookmarkEnd w:id="67"/>
+    <w:bookmarkEnd w:id="68"/>
+    <w:bookmarkEnd w:id="69"/>
     <w:sectPr>
       <w:footnotePr>
         <w:numRestart w:val="eachSect"/>
@@ -14226,6 +15114,33 @@
     <w:abstractNumId w:val="991"/>
   </w:num>
   <w:num w:numId="1160">
+    <w:abstractNumId w:val="991"/>
+  </w:num>
+  <w:num w:numId="1161">
+    <w:abstractNumId w:val="991"/>
+  </w:num>
+  <w:num w:numId="1162">
+    <w:abstractNumId w:val="991"/>
+  </w:num>
+  <w:num w:numId="1163">
+    <w:abstractNumId w:val="991"/>
+  </w:num>
+  <w:num w:numId="1164">
+    <w:abstractNumId w:val="991"/>
+  </w:num>
+  <w:num w:numId="1165">
+    <w:abstractNumId w:val="991"/>
+  </w:num>
+  <w:num w:numId="1166">
+    <w:abstractNumId w:val="991"/>
+  </w:num>
+  <w:num w:numId="1167">
+    <w:abstractNumId w:val="991"/>
+  </w:num>
+  <w:num w:numId="1168">
+    <w:abstractNumId w:val="991"/>
+  </w:num>
+  <w:num w:numId="1169">
     <w:abstractNumId w:val="991"/>
   </w:num>
 </w:numbering>

</xml_diff>